<commit_message>
Turn a measured page before blank lines too, and keep a Word file of over 20,000 drawn elements as long sheets rather than draw it twice
</commit_message>
<xml_diff>
--- a/tests/fixtures/files/word-measured.docx
+++ b/tests/fixtures/files/word-measured.docx
@@ -844,6 +844,41 @@
         </w:tc>
       </w:tr>
     </w:tbl>
+    <w:p/>
+    <w:p/>
+    <w:p/>
+    <w:p/>
+    <w:p/>
+    <w:p/>
+    <w:p/>
+    <w:p/>
+    <w:p/>
+    <w:p/>
+    <w:p/>
+    <w:p/>
+    <w:p/>
+    <w:p/>
+    <w:p/>
+    <w:p/>
+    <w:p/>
+    <w:p/>
+    <w:p/>
+    <w:p/>
+    <w:p/>
+    <w:p/>
+    <w:p/>
+    <w:p/>
+    <w:p/>
+    <w:p/>
+    <w:p/>
+    <w:p/>
+    <w:p/>
+    <w:p/>
+    <w:p>
+      <w:r>
+        <w:t>Last line</w:t>
+      </w:r>
+    </w:p>
     <w:sectPr>
       <w:footerReference w:type="default" r:id="rId9"/>
       <w:pgSz w:w="12240" w:h="15840"/>

</xml_diff>